<commit_message>
OV02 v4 worksheet: de-telegraph - drop 'open items/confirm/correct any line' audit cues; AKI-principal now reads as the coder's settled assignment (review obligation carried by the prompt). verify green.
</commit_message>
<xml_diff>
--- a/worlds/ondina-vasquell/phase-3-build-task-artifacts/platform/task2/current/him_working_drg_worksheet_05212026.docx
+++ b/worlds/ondina-vasquell/phase-3-build-task-artifacts/platform/task2/current/him_working_drg_worksheet_05212026.docx
@@ -562,7 +562,7 @@
           <w:color w:val="232830"/>
           <w:sz w:val="19"/>
         </w:rPr>
-        <w:t>Preliminary sequencing and working DRG for provider review and attestation. Please confirm the principal diagnosis and the working DRG family, or correct any line and provide the supporting basis.</w:t>
+        <w:t>Preliminary code sequencing and working DRG prepared by HIM coding, routed for provider attestation.</w:t>
       </w:r>
     </w:p>
     <w:p>
@@ -1048,7 +1048,7 @@
           <w:color w:val="232830"/>
           <w:sz w:val="19"/>
         </w:rPr>
-        <w:t>Open items for attending review: please confirm the final principal diagnosis sequencing and the working DRG family, and correct any line that does not reflect the documentation.</w:t>
+        <w:t>Working DRG assigned on the sequencing above. Routed to the attending for attestation to finalize the claim.</w:t>
       </w:r>
     </w:p>
     <w:p>

</xml_diff>